<commit_message>
entregada traductores - PVVC - embebed
</commit_message>
<xml_diff>
--- a/sistemas_operativos/proyecto/PROPUESTA PROYECTO_vv.docx
+++ b/sistemas_operativos/proyecto/PROPUESTA PROYECTO_vv.docx
@@ -25,7 +25,18 @@
         <w:t xml:space="preserve"> </w:t>
       </w:r>
       <w:r>
-        <w:t>(Andromeada Shell)</w:t>
+        <w:t>(</w:t>
+      </w:r>
+      <w:proofErr w:type="spellStart"/>
+      <w:r>
+        <w:t>Androme</w:t>
+      </w:r>
+      <w:r>
+        <w:t>da</w:t>
+      </w:r>
+      <w:proofErr w:type="spellEnd"/>
+      <w:r>
+        <w:t xml:space="preserve"> Shell)</w:t>
       </w:r>
       <w:r>
         <w:rPr>
@@ -95,8 +106,36 @@
           <w:b/>
           <w:sz w:val="24"/>
         </w:rPr>
-        <w:t>Armando Tepale Chocolatl</w:t>
-      </w:r>
+        <w:t xml:space="preserve">Armando </w:t>
+      </w:r>
+      <w:proofErr w:type="spellStart"/>
+      <w:r>
+        <w:rPr>
+          <w:rFonts w:ascii="Arial"/>
+          <w:b/>
+          <w:sz w:val="24"/>
+        </w:rPr>
+        <w:t>Tepale</w:t>
+      </w:r>
+      <w:proofErr w:type="spellEnd"/>
+      <w:r>
+        <w:rPr>
+          <w:rFonts w:ascii="Arial"/>
+          <w:b/>
+          <w:sz w:val="24"/>
+        </w:rPr>
+        <w:t xml:space="preserve"> </w:t>
+      </w:r>
+      <w:proofErr w:type="spellStart"/>
+      <w:r>
+        <w:rPr>
+          <w:rFonts w:ascii="Arial"/>
+          <w:b/>
+          <w:sz w:val="24"/>
+        </w:rPr>
+        <w:t>Chocolatl</w:t>
+      </w:r>
+      <w:proofErr w:type="spellEnd"/>
       <w:r>
         <w:rPr>
           <w:rFonts w:ascii="Arial"/>
@@ -129,7 +168,25 @@
           <w:b/>
           <w:sz w:val="24"/>
         </w:rPr>
-        <w:t xml:space="preserve">1280222 Erick Garcia Chavez - </w:t>
+        <w:t xml:space="preserve">1280222 Erick Garcia </w:t>
+      </w:r>
+      <w:proofErr w:type="spellStart"/>
+      <w:r>
+        <w:rPr>
+          <w:rFonts w:ascii="Arial"/>
+          <w:b/>
+          <w:sz w:val="24"/>
+        </w:rPr>
+        <w:t>Chavez</w:t>
+      </w:r>
+      <w:proofErr w:type="spellEnd"/>
+      <w:r>
+        <w:rPr>
+          <w:rFonts w:ascii="Arial"/>
+          <w:b/>
+          <w:sz w:val="24"/>
+        </w:rPr>
+        <w:t xml:space="preserve"> - </w:t>
       </w:r>
       <w:r>
         <w:rPr>
@@ -195,8 +252,16 @@
         <w:rPr>
           <w:b/>
         </w:rPr>
-        <w:t>cifra-xor</w:t>
-      </w:r>
+        <w:t>cifra-</w:t>
+      </w:r>
+      <w:proofErr w:type="spellStart"/>
+      <w:r>
+        <w:rPr>
+          <w:b/>
+        </w:rPr>
+        <w:t>xor</w:t>
+      </w:r>
+      <w:proofErr w:type="spellEnd"/>
     </w:p>
     <w:p>
       <w:pPr>
@@ -255,7 +320,14 @@
           <w:rFonts w:ascii="Arial" w:hAnsi="Arial" w:cs="Arial"/>
         </w:rPr>
         <w:br/>
-        <w:t>Cada ejecución genera un archivo de sumas de verificación (</w:t>
+        <w:t xml:space="preserve">Cada ejecución genera un archivo de sumas de verificación </w:t>
+      </w:r>
+      <w:proofErr w:type="gramStart"/>
+      <w:r>
+        <w:rPr>
+          <w:rFonts w:ascii="Arial" w:hAnsi="Arial" w:cs="Arial"/>
+        </w:rPr>
+        <w:t>(</w:t>
       </w:r>
       <w:r>
         <w:rPr>
@@ -264,8 +336,29 @@
           <w:sz w:val="24"/>
           <w:szCs w:val="24"/>
         </w:rPr>
-        <w:t>.integrity.db</w:t>
-      </w:r>
+        <w:t>.</w:t>
+      </w:r>
+      <w:proofErr w:type="spellStart"/>
+      <w:r>
+        <w:rPr>
+          <w:rStyle w:val="HTMLCode"/>
+          <w:rFonts w:ascii="Arial" w:eastAsia="Arial MT" w:hAnsi="Arial" w:cs="Arial"/>
+          <w:sz w:val="24"/>
+          <w:szCs w:val="24"/>
+        </w:rPr>
+        <w:t>integrity</w:t>
+      </w:r>
+      <w:proofErr w:type="gramEnd"/>
+      <w:r>
+        <w:rPr>
+          <w:rStyle w:val="HTMLCode"/>
+          <w:rFonts w:ascii="Arial" w:eastAsia="Arial MT" w:hAnsi="Arial" w:cs="Arial"/>
+          <w:sz w:val="24"/>
+          <w:szCs w:val="24"/>
+        </w:rPr>
+        <w:t>.db</w:t>
+      </w:r>
+      <w:proofErr w:type="spellEnd"/>
       <w:r>
         <w:rPr>
           <w:rFonts w:ascii="Arial" w:hAnsi="Arial" w:cs="Arial"/>
@@ -368,8 +461,16 @@
         <w:rPr>
           <w:b/>
         </w:rPr>
-        <w:t>fantasma-rm</w:t>
-      </w:r>
+        <w:t>fantasma-</w:t>
+      </w:r>
+      <w:proofErr w:type="spellStart"/>
+      <w:r>
+        <w:rPr>
+          <w:b/>
+        </w:rPr>
+        <w:t>rm</w:t>
+      </w:r>
+      <w:proofErr w:type="spellEnd"/>
     </w:p>
     <w:p>
       <w:pPr>
@@ -378,7 +479,31 @@
         <w:jc w:val="both"/>
       </w:pPr>
       <w:r>
-        <w:t>Mueve el contenido de un archivo a una 'zona fantasma' oculta y borra el original, la zona fantasma se tendrá su propia dirección en ~/.Andromeda_shell/.ghostzone/</w:t>
+        <w:t>Mueve el contenido de un archivo a una 'zona fantasma' oculta y borra el original, la zona fantasma se tendrá su propia dirección en ~</w:t>
+      </w:r>
+      <w:proofErr w:type="gramStart"/>
+      <w:r>
+        <w:t>/.</w:t>
+      </w:r>
+      <w:proofErr w:type="spellStart"/>
+      <w:r>
+        <w:t>Andromeda</w:t>
+      </w:r>
+      <w:proofErr w:type="gramEnd"/>
+      <w:r>
+        <w:t>_shell</w:t>
+      </w:r>
+      <w:proofErr w:type="spellEnd"/>
+      <w:r>
+        <w:t>/.</w:t>
+      </w:r>
+      <w:proofErr w:type="spellStart"/>
+      <w:r>
+        <w:t>ghostzone</w:t>
+      </w:r>
+      <w:proofErr w:type="spellEnd"/>
+      <w:r>
+        <w:t>/</w:t>
       </w:r>
     </w:p>
     <w:p>

</xml_diff>